<commit_message>
Kim11-3-1-Yesil-Hidrojen: gorsel alanlarina Shutter onizlemeleri yerlestirildi (2.3 bicimi)
</commit_message>
<xml_diff>
--- a/Kim11-3-1-Yesil-Hidrojen.docx
+++ b/Kim11-3-1-Yesil-Hidrojen.docx
@@ -42,449 +42,371 @@
         <w:t xml:space="preserve">BÖLÜM: Nanoteknoloji ve Sürdürülebilirlik</w:t>
       </w:r>
     </w:p>
-    <w:tbl>
-      <w:tblPr>
-        <w:tblW w:w="9000" w:type="dxa"/>
+    <w:p>
+      <w:pPr>
         <w:jc w:val="center"/>
-        <w:tblBorders>
-          <w:top w:val="single" w:sz="8" w:space="0" w:color="7F7F7F"/>
-          <w:left w:val="single" w:sz="8" w:space="0" w:color="7F7F7F"/>
-          <w:bottom w:val="single" w:sz="8" w:space="0" w:color="7F7F7F"/>
-          <w:right w:val="single" w:sz="8" w:space="0" w:color="7F7F7F"/>
-        </w:tblBorders>
-      </w:tblPr>
-      <w:tblGrid>
-        <w:gridCol w:w="9000"/>
-      </w:tblGrid>
-      <w:tr>
-        <w:tc>
-          <w:tcPr>
-            <w:tcW w:w="9000" w:type="dxa"/>
-            <w:shd w:val="clear" w:color="auto" w:fill="EDEDED"/>
-          </w:tcPr>
-          <w:p>
-            <w:pPr>
-              <w:jc w:val="both"/>
-              <w:rPr>
-                <w:rFonts w:ascii="Times New Roman" w:hAnsi="Times New Roman" w:cs="Times New Roman"/>
-                <w:lang w:val="tr-TR"/>
-              </w:rPr>
-            </w:pPr>
-            <w:r>
-              <w:rPr>
-                <w:rFonts w:ascii="Times New Roman" w:hAnsi="Times New Roman" w:cs="Times New Roman"/>
-                <w:lang w:val="tr-TR"/>
-              </w:rPr>
-              <w:t xml:space="preserve">GÖRSEL ALANI (Shutterstock)</w:t>
-            </w:r>
-          </w:p>
-          <w:p>
-            <w:pPr>
-              <w:jc w:val="both"/>
-              <w:rPr>
-                <w:rFonts w:ascii="Times New Roman" w:hAnsi="Times New Roman" w:cs="Times New Roman"/>
-                <w:lang w:val="tr-TR"/>
-              </w:rPr>
-            </w:pPr>
-            <w:r>
-              <w:rPr>
-                <w:rFonts w:ascii="Times New Roman" w:hAnsi="Times New Roman" w:cs="Times New Roman"/>
-                <w:lang w:val="tr-TR"/>
-              </w:rPr>
-              <w:t xml:space="preserve">Tarif: Rüzgâr türbinleri ve güneş panelleri bulunan yeşil bir arazide, ön planda hidrojen molekülü (H₂) simgesi ya da hidrojen yakıt istasyonu; temiz enerji temalı tema açılış görseli (tam sayfa).</w:t>
-            </w:r>
-          </w:p>
-          <w:p>
-            <w:pPr>
-              <w:jc w:val="both"/>
-              <w:rPr>
-                <w:rFonts w:ascii="Times New Roman" w:hAnsi="Times New Roman" w:cs="Times New Roman"/>
-                <w:lang w:val="tr-TR"/>
-              </w:rPr>
-            </w:pPr>
-            <w:r>
-              <w:rPr>
-                <w:rFonts w:ascii="Times New Roman" w:hAnsi="Times New Roman" w:cs="Times New Roman"/>
-                <w:lang w:val="tr-TR"/>
-              </w:rPr>
-              <w:t xml:space="preserve">Shutter ID: 2438110191 (fotoğraf) — Green hydrogen production with solar panels and wind turbines</w:t>
-            </w:r>
-          </w:p>
-        </w:tc>
-      </w:tr>
-    </w:tbl>
-    <w:p>
-      <w:pPr>
-        <w:jc w:val="both"/>
-        <w:rPr>
-          <w:rFonts w:ascii="Times New Roman" w:hAnsi="Times New Roman" w:cs="Times New Roman"/>
-          <w:lang w:val="tr-TR"/>
-        </w:rPr>
-      </w:pPr>
+      </w:pPr>
+      <w:r>
+        <w:drawing>
+          <wp:inline xmlns:a="http://schemas.openxmlformats.org/drawingml/2006/main" xmlns:pic="http://schemas.openxmlformats.org/drawingml/2006/picture">
+            <wp:extent cx="5400000" cy="3978000"/>
+            <wp:docPr id="900013" name="Picture 900013"/>
+            <wp:cNvGraphicFramePr>
+              <a:graphicFrameLocks noChangeAspect="1"/>
+            </wp:cNvGraphicFramePr>
+            <a:graphic>
+              <a:graphicData uri="http://schemas.openxmlformats.org/drawingml/2006/picture">
+                <pic:pic>
+                  <pic:nvPicPr>
+                    <pic:cNvPr id="0" name="2438110191_d.jpg"/>
+                    <pic:cNvPicPr/>
+                  </pic:nvPicPr>
+                  <pic:blipFill>
+                    <a:blip r:embed="rId13"/>
+                    <a:stretch>
+                      <a:fillRect/>
+                    </a:stretch>
+                  </pic:blipFill>
+                  <pic:spPr>
+                    <a:xfrm>
+                      <a:off x="0" y="0"/>
+                      <a:ext cx="5400000" cy="3978000"/>
+                    </a:xfrm>
+                    <a:prstGeom prst="rect"/>
+                  </pic:spPr>
+                </pic:pic>
+              </a:graphicData>
+            </a:graphic>
+          </wp:inline>
+        </w:drawing>
+      </w:r>
     </w:p>
     <w:p>
       <w:pPr>
         <w:jc w:val="center"/>
-        <w:rPr>
-          <w:rFonts w:ascii="Times New Roman" w:hAnsi="Times New Roman" w:cs="Times New Roman"/>
-          <w:lang w:val="tr-TR"/>
-        </w:rPr>
       </w:pPr>
       <w:r>
         <w:rPr>
           <w:rFonts w:ascii="Times New Roman" w:hAnsi="Times New Roman" w:cs="Times New Roman"/>
           <w:b/>
           <w:bCs/>
-          <w:lang w:val="tr-TR"/>
-        </w:rPr>
-        <w:t xml:space="preserve">Görsel A:</w:t>
-      </w:r>
-      <w:r>
-        <w:rPr>
-          <w:rFonts w:ascii="Times New Roman" w:hAnsi="Times New Roman" w:cs="Times New Roman"/>
-          <w:lang w:val="tr-TR"/>
-        </w:rPr>
-        <w:t xml:space="preserve"> Sürdürülebilir bir gelecek</w:t>
-      </w:r>
-    </w:p>
-    <w:p>
-      <w:pPr>
-        <w:jc w:val="both"/>
+          <w:highlight w:val="yellow"/>
+          <w:lang w:val="tr-TR"/>
+        </w:rPr>
+        <w:t xml:space="preserve">Shutter id: 2438110191 (bölüm kapağı, tam sayfa)</w:t>
+      </w:r>
+    </w:p>
+    <w:p>
+      <w:pPr>
+        <w:jc w:val="center"/>
+        <w:rPr>
+          <w:rFonts w:ascii="Times New Roman" w:hAnsi="Times New Roman" w:cs="Times New Roman"/>
+          <w:lang w:val="tr-TR"/>
+        </w:rPr>
+      </w:pPr>
+      <w:r>
         <w:rPr>
           <w:rFonts w:ascii="Times New Roman" w:hAnsi="Times New Roman" w:cs="Times New Roman"/>
           <w:b/>
           <w:bCs/>
           <w:lang w:val="tr-TR"/>
         </w:rPr>
-      </w:pPr>
-      <w:r>
+        <w:t xml:space="preserve">Görsel A:</w:t>
+      </w:r>
+      <w:r>
+        <w:rPr>
+          <w:rFonts w:ascii="Times New Roman" w:hAnsi="Times New Roman" w:cs="Times New Roman"/>
+          <w:lang w:val="tr-TR"/>
+        </w:rPr>
+        <w:t xml:space="preserve"> Sürdürülebilir bir gelecek</w:t>
+      </w:r>
+    </w:p>
+    <w:p>
+      <w:pPr>
+        <w:jc w:val="both"/>
         <w:rPr>
           <w:rFonts w:ascii="Times New Roman" w:hAnsi="Times New Roman" w:cs="Times New Roman"/>
           <w:b/>
           <w:bCs/>
           <w:lang w:val="tr-TR"/>
         </w:rPr>
-        <w:t xml:space="preserve">Temanın Anahtar Kavramları</w:t>
-      </w:r>
-    </w:p>
-    <w:p>
-      <w:pPr>
-        <w:ind w:left="360"/>
-        <w:jc w:val="both"/>
-        <w:rPr>
-          <w:rFonts w:ascii="Times New Roman" w:hAnsi="Times New Roman" w:cs="Times New Roman"/>
-          <w:lang w:val="tr-TR"/>
-        </w:rPr>
-      </w:pPr>
-      <w:r>
-        <w:rPr>
-          <w:rFonts w:ascii="Times New Roman" w:hAnsi="Times New Roman" w:cs="Times New Roman"/>
-          <w:lang w:val="tr-TR"/>
-        </w:rPr>
-        <w:t xml:space="preserve">• Mikroplastik</w:t>
-      </w:r>
-    </w:p>
-    <w:p>
-      <w:pPr>
-        <w:ind w:left="360"/>
-        <w:jc w:val="both"/>
-        <w:rPr>
-          <w:rFonts w:ascii="Times New Roman" w:hAnsi="Times New Roman" w:cs="Times New Roman"/>
-          <w:lang w:val="tr-TR"/>
-        </w:rPr>
-      </w:pPr>
-      <w:r>
-        <w:rPr>
-          <w:rFonts w:ascii="Times New Roman" w:hAnsi="Times New Roman" w:cs="Times New Roman"/>
-          <w:lang w:val="tr-TR"/>
-        </w:rPr>
-        <w:t xml:space="preserve">• Nanoplastik</w:t>
-      </w:r>
-    </w:p>
-    <w:p>
-      <w:pPr>
-        <w:ind w:left="360"/>
-        <w:jc w:val="both"/>
-        <w:rPr>
-          <w:rFonts w:ascii="Times New Roman" w:hAnsi="Times New Roman" w:cs="Times New Roman"/>
-          <w:lang w:val="tr-TR"/>
-        </w:rPr>
-      </w:pPr>
-      <w:r>
-        <w:rPr>
-          <w:rFonts w:ascii="Times New Roman" w:hAnsi="Times New Roman" w:cs="Times New Roman"/>
-          <w:lang w:val="tr-TR"/>
-        </w:rPr>
-        <w:t xml:space="preserve">• Nanoteknoloji</w:t>
-      </w:r>
-    </w:p>
-    <w:p>
-      <w:pPr>
-        <w:ind w:left="360"/>
-        <w:jc w:val="both"/>
-        <w:rPr>
-          <w:rFonts w:ascii="Times New Roman" w:hAnsi="Times New Roman" w:cs="Times New Roman"/>
-          <w:lang w:val="tr-TR"/>
-        </w:rPr>
-      </w:pPr>
-      <w:r>
-        <w:rPr>
-          <w:rFonts w:ascii="Times New Roman" w:hAnsi="Times New Roman" w:cs="Times New Roman"/>
-          <w:lang w:val="tr-TR"/>
-        </w:rPr>
-        <w:t xml:space="preserve">• Yeşil hidrojen enerjisi</w:t>
-      </w:r>
-    </w:p>
-    <w:p>
-      <w:pPr>
-        <w:jc w:val="both"/>
+      </w:pPr>
+      <w:r>
         <w:rPr>
           <w:rFonts w:ascii="Times New Roman" w:hAnsi="Times New Roman" w:cs="Times New Roman"/>
           <w:b/>
           <w:bCs/>
           <w:lang w:val="tr-TR"/>
         </w:rPr>
-      </w:pPr>
-      <w:r>
+        <w:t xml:space="preserve">Temanın Anahtar Kavramları</w:t>
+      </w:r>
+    </w:p>
+    <w:p>
+      <w:pPr>
+        <w:ind w:left="360"/>
+        <w:jc w:val="both"/>
+        <w:rPr>
+          <w:rFonts w:ascii="Times New Roman" w:hAnsi="Times New Roman" w:cs="Times New Roman"/>
+          <w:lang w:val="tr-TR"/>
+        </w:rPr>
+      </w:pPr>
+      <w:r>
+        <w:rPr>
+          <w:rFonts w:ascii="Times New Roman" w:hAnsi="Times New Roman" w:cs="Times New Roman"/>
+          <w:lang w:val="tr-TR"/>
+        </w:rPr>
+        <w:t xml:space="preserve">• Mikroplastik</w:t>
+      </w:r>
+    </w:p>
+    <w:p>
+      <w:pPr>
+        <w:ind w:left="360"/>
+        <w:jc w:val="both"/>
+        <w:rPr>
+          <w:rFonts w:ascii="Times New Roman" w:hAnsi="Times New Roman" w:cs="Times New Roman"/>
+          <w:lang w:val="tr-TR"/>
+        </w:rPr>
+      </w:pPr>
+      <w:r>
+        <w:rPr>
+          <w:rFonts w:ascii="Times New Roman" w:hAnsi="Times New Roman" w:cs="Times New Roman"/>
+          <w:lang w:val="tr-TR"/>
+        </w:rPr>
+        <w:t xml:space="preserve">• Nanoplastik</w:t>
+      </w:r>
+    </w:p>
+    <w:p>
+      <w:pPr>
+        <w:ind w:left="360"/>
+        <w:jc w:val="both"/>
+        <w:rPr>
+          <w:rFonts w:ascii="Times New Roman" w:hAnsi="Times New Roman" w:cs="Times New Roman"/>
+          <w:lang w:val="tr-TR"/>
+        </w:rPr>
+      </w:pPr>
+      <w:r>
+        <w:rPr>
+          <w:rFonts w:ascii="Times New Roman" w:hAnsi="Times New Roman" w:cs="Times New Roman"/>
+          <w:lang w:val="tr-TR"/>
+        </w:rPr>
+        <w:t xml:space="preserve">• Nanoteknoloji</w:t>
+      </w:r>
+    </w:p>
+    <w:p>
+      <w:pPr>
+        <w:ind w:left="360"/>
+        <w:jc w:val="both"/>
+        <w:rPr>
+          <w:rFonts w:ascii="Times New Roman" w:hAnsi="Times New Roman" w:cs="Times New Roman"/>
+          <w:lang w:val="tr-TR"/>
+        </w:rPr>
+      </w:pPr>
+      <w:r>
+        <w:rPr>
+          <w:rFonts w:ascii="Times New Roman" w:hAnsi="Times New Roman" w:cs="Times New Roman"/>
+          <w:lang w:val="tr-TR"/>
+        </w:rPr>
+        <w:t xml:space="preserve">• Yeşil hidrojen enerjisi</w:t>
+      </w:r>
+    </w:p>
+    <w:p>
+      <w:pPr>
+        <w:jc w:val="both"/>
         <w:rPr>
           <w:rFonts w:ascii="Times New Roman" w:hAnsi="Times New Roman" w:cs="Times New Roman"/>
           <w:b/>
           <w:bCs/>
           <w:lang w:val="tr-TR"/>
         </w:rPr>
-        <w:t xml:space="preserve">Bu Temada Neler Öğreneceksiniz?</w:t>
-      </w:r>
-    </w:p>
-    <w:p>
-      <w:pPr>
-        <w:ind w:left="360"/>
-        <w:jc w:val="both"/>
-        <w:rPr>
-          <w:rFonts w:ascii="Times New Roman" w:hAnsi="Times New Roman" w:cs="Times New Roman"/>
-          <w:lang w:val="tr-TR"/>
-        </w:rPr>
-      </w:pPr>
-      <w:r>
-        <w:rPr>
-          <w:rFonts w:ascii="Times New Roman" w:hAnsi="Times New Roman" w:cs="Times New Roman"/>
-          <w:lang w:val="tr-TR"/>
-        </w:rPr>
-        <w:t xml:space="preserve">• Evsel atıklardan fermantasyon yöntemi ile yeşil hidrojen enerjisi elde etme sürecine yönelik hipotez oluşturacaksınız.</w:t>
-      </w:r>
-    </w:p>
-    <w:p>
-      <w:pPr>
-        <w:ind w:left="360"/>
-        <w:jc w:val="both"/>
-        <w:rPr>
-          <w:rFonts w:ascii="Times New Roman" w:hAnsi="Times New Roman" w:cs="Times New Roman"/>
-          <w:lang w:val="tr-TR"/>
-        </w:rPr>
-      </w:pPr>
-      <w:r>
-        <w:rPr>
-          <w:rFonts w:ascii="Times New Roman" w:hAnsi="Times New Roman" w:cs="Times New Roman"/>
-          <w:lang w:val="tr-TR"/>
-        </w:rPr>
-        <w:t xml:space="preserve">• Nanoteknolojik ürünlerin seçimine yönelik eleştirel düşüneceksiniz.</w:t>
-      </w:r>
-    </w:p>
-    <w:p>
-      <w:pPr>
-        <w:ind w:left="360"/>
-        <w:jc w:val="both"/>
-        <w:rPr>
-          <w:rFonts w:ascii="Times New Roman" w:hAnsi="Times New Roman" w:cs="Times New Roman"/>
-          <w:lang w:val="tr-TR"/>
-        </w:rPr>
-      </w:pPr>
-      <w:r>
-        <w:rPr>
-          <w:rFonts w:ascii="Times New Roman" w:hAnsi="Times New Roman" w:cs="Times New Roman"/>
-          <w:lang w:val="tr-TR"/>
-        </w:rPr>
-        <w:t xml:space="preserve">• Mikroplastik ve nanoplastiklerin etkilerini sorgulayacaksınız.</w:t>
-      </w:r>
-    </w:p>
-    <w:p>
-      <w:pPr>
-        <w:jc w:val="both"/>
+      </w:pPr>
+      <w:r>
         <w:rPr>
           <w:rFonts w:ascii="Times New Roman" w:hAnsi="Times New Roman" w:cs="Times New Roman"/>
           <w:b/>
           <w:bCs/>
           <w:lang w:val="tr-TR"/>
         </w:rPr>
-      </w:pPr>
-      <w:r>
+        <w:t xml:space="preserve">Bu Temada Neler Öğreneceksiniz?</w:t>
+      </w:r>
+    </w:p>
+    <w:p>
+      <w:pPr>
+        <w:ind w:left="360"/>
+        <w:jc w:val="both"/>
+        <w:rPr>
+          <w:rFonts w:ascii="Times New Roman" w:hAnsi="Times New Roman" w:cs="Times New Roman"/>
+          <w:lang w:val="tr-TR"/>
+        </w:rPr>
+      </w:pPr>
+      <w:r>
+        <w:rPr>
+          <w:rFonts w:ascii="Times New Roman" w:hAnsi="Times New Roman" w:cs="Times New Roman"/>
+          <w:lang w:val="tr-TR"/>
+        </w:rPr>
+        <w:t xml:space="preserve">• Evsel atıklardan fermantasyon yöntemi ile yeşil hidrojen enerjisi elde etme sürecine yönelik hipotez oluşturacaksınız.</w:t>
+      </w:r>
+    </w:p>
+    <w:p>
+      <w:pPr>
+        <w:ind w:left="360"/>
+        <w:jc w:val="both"/>
+        <w:rPr>
+          <w:rFonts w:ascii="Times New Roman" w:hAnsi="Times New Roman" w:cs="Times New Roman"/>
+          <w:lang w:val="tr-TR"/>
+        </w:rPr>
+      </w:pPr>
+      <w:r>
+        <w:rPr>
+          <w:rFonts w:ascii="Times New Roman" w:hAnsi="Times New Roman" w:cs="Times New Roman"/>
+          <w:lang w:val="tr-TR"/>
+        </w:rPr>
+        <w:t xml:space="preserve">• Nanoteknolojik ürünlerin seçimine yönelik eleştirel düşüneceksiniz.</w:t>
+      </w:r>
+    </w:p>
+    <w:p>
+      <w:pPr>
+        <w:ind w:left="360"/>
+        <w:jc w:val="both"/>
+        <w:rPr>
+          <w:rFonts w:ascii="Times New Roman" w:hAnsi="Times New Roman" w:cs="Times New Roman"/>
+          <w:lang w:val="tr-TR"/>
+        </w:rPr>
+      </w:pPr>
+      <w:r>
+        <w:rPr>
+          <w:rFonts w:ascii="Times New Roman" w:hAnsi="Times New Roman" w:cs="Times New Roman"/>
+          <w:lang w:val="tr-TR"/>
+        </w:rPr>
+        <w:t xml:space="preserve">• Mikroplastik ve nanoplastiklerin etkilerini sorgulayacaksınız.</w:t>
+      </w:r>
+    </w:p>
+    <w:p>
+      <w:pPr>
+        <w:jc w:val="both"/>
         <w:rPr>
           <w:rFonts w:ascii="Times New Roman" w:hAnsi="Times New Roman" w:cs="Times New Roman"/>
           <w:b/>
           <w:bCs/>
           <w:lang w:val="tr-TR"/>
         </w:rPr>
+      </w:pPr>
+      <w:r>
+        <w:rPr>
+          <w:rFonts w:ascii="Times New Roman" w:hAnsi="Times New Roman" w:cs="Times New Roman"/>
+          <w:b/>
+          <w:bCs/>
+          <w:lang w:val="tr-TR"/>
+        </w:rPr>
         <w:t xml:space="preserve">BÖLÜM: Nanoteknoloji ve Sürdürülebilirlik</w:t>
       </w:r>
     </w:p>
-    <w:tbl>
-      <w:tblPr>
-        <w:tblW w:w="9000" w:type="dxa"/>
+    <w:p>
+      <w:pPr>
         <w:jc w:val="center"/>
-        <w:tblBorders>
-          <w:top w:val="single" w:sz="8" w:space="0" w:color="7F7F7F"/>
-          <w:left w:val="single" w:sz="8" w:space="0" w:color="7F7F7F"/>
-          <w:bottom w:val="single" w:sz="8" w:space="0" w:color="7F7F7F"/>
-          <w:right w:val="single" w:sz="8" w:space="0" w:color="7F7F7F"/>
-        </w:tblBorders>
-      </w:tblPr>
-      <w:tblGrid>
-        <w:gridCol w:w="9000"/>
-      </w:tblGrid>
-      <w:tr>
-        <w:tc>
-          <w:tcPr>
-            <w:tcW w:w="9000" w:type="dxa"/>
-            <w:shd w:val="clear" w:color="auto" w:fill="EDEDED"/>
-          </w:tcPr>
-          <w:p>
-            <w:pPr>
-              <w:jc w:val="both"/>
-              <w:rPr>
-                <w:rFonts w:ascii="Times New Roman" w:hAnsi="Times New Roman" w:cs="Times New Roman"/>
-                <w:lang w:val="tr-TR"/>
-              </w:rPr>
-            </w:pPr>
-            <w:r>
-              <w:rPr>
-                <w:rFonts w:ascii="Times New Roman" w:hAnsi="Times New Roman" w:cs="Times New Roman"/>
-                <w:lang w:val="tr-TR"/>
-              </w:rPr>
-              <w:t xml:space="preserve">GÖRSEL ALANI (Bölüm kapağı, tam sayfa; Shutterstock)</w:t>
-            </w:r>
-          </w:p>
-          <w:p>
-            <w:pPr>
-              <w:jc w:val="both"/>
-              <w:rPr>
-                <w:rFonts w:ascii="Times New Roman" w:hAnsi="Times New Roman" w:cs="Times New Roman"/>
-                <w:lang w:val="tr-TR"/>
-              </w:rPr>
-            </w:pPr>
-            <w:r>
-              <w:rPr>
-                <w:rFonts w:ascii="Times New Roman" w:hAnsi="Times New Roman" w:cs="Times New Roman"/>
-                <w:lang w:val="tr-TR"/>
-              </w:rPr>
-              <w:t xml:space="preserve">Tarif: Yeşil bir yaprağın üzerinde nano ölçekli altıgen yapı deseni ve arka planda rüzgâr türbinleri; bilim ve doğa uyumunu anlatan sürdürülebilirlik temalı görsel (tam sayfa bölüm kapağı).</w:t>
-            </w:r>
-          </w:p>
-          <w:p>
-            <w:pPr>
-              <w:jc w:val="both"/>
-              <w:rPr>
-                <w:rFonts w:ascii="Times New Roman" w:hAnsi="Times New Roman" w:cs="Times New Roman"/>
-                <w:lang w:val="tr-TR"/>
-              </w:rPr>
-            </w:pPr>
-            <w:r>
-              <w:rPr>
-                <w:rFonts w:ascii="Times New Roman" w:hAnsi="Times New Roman" w:cs="Times New Roman"/>
-                <w:lang w:val="tr-TR"/>
-              </w:rPr>
-              <w:t xml:space="preserve">Shutter ID: 4198128129 (fotoğraf) — Close-up of a lush green leaf with technology pattern</w:t>
-            </w:r>
-          </w:p>
-        </w:tc>
-      </w:tr>
-    </w:tbl>
-    <w:p>
-      <w:pPr>
-        <w:jc w:val="both"/>
-        <w:rPr>
-          <w:rFonts w:ascii="Times New Roman" w:hAnsi="Times New Roman" w:cs="Times New Roman"/>
-          <w:lang w:val="tr-TR"/>
-        </w:rPr>
-      </w:pPr>
-    </w:p>
-    <w:tbl>
-      <w:tblPr>
-        <w:tblW w:w="9000" w:type="dxa"/>
+      </w:pPr>
+      <w:r>
+        <w:drawing>
+          <wp:inline xmlns:a="http://schemas.openxmlformats.org/drawingml/2006/main" xmlns:pic="http://schemas.openxmlformats.org/drawingml/2006/picture">
+            <wp:extent cx="5400000" cy="3394800"/>
+            <wp:docPr id="900014" name="Picture 900014"/>
+            <wp:cNvGraphicFramePr>
+              <a:graphicFrameLocks noChangeAspect="1"/>
+            </wp:cNvGraphicFramePr>
+            <a:graphic>
+              <a:graphicData uri="http://schemas.openxmlformats.org/drawingml/2006/picture">
+                <pic:pic>
+                  <pic:nvPicPr>
+                    <pic:cNvPr id="0" name="4198128129_d.jpg"/>
+                    <pic:cNvPicPr/>
+                  </pic:nvPicPr>
+                  <pic:blipFill>
+                    <a:blip r:embed="rId14"/>
+                    <a:stretch>
+                      <a:fillRect/>
+                    </a:stretch>
+                  </pic:blipFill>
+                  <pic:spPr>
+                    <a:xfrm>
+                      <a:off x="0" y="0"/>
+                      <a:ext cx="5400000" cy="3394800"/>
+                    </a:xfrm>
+                    <a:prstGeom prst="rect"/>
+                  </pic:spPr>
+                </pic:pic>
+              </a:graphicData>
+            </a:graphic>
+          </wp:inline>
+        </w:drawing>
+      </w:r>
+    </w:p>
+    <w:p>
+      <w:pPr>
         <w:jc w:val="center"/>
-        <w:tblBorders>
-          <w:top w:val="single" w:sz="8" w:space="0" w:color="7F7F7F"/>
-          <w:left w:val="single" w:sz="8" w:space="0" w:color="7F7F7F"/>
-          <w:bottom w:val="single" w:sz="8" w:space="0" w:color="7F7F7F"/>
-          <w:right w:val="single" w:sz="8" w:space="0" w:color="7F7F7F"/>
-        </w:tblBorders>
-      </w:tblPr>
-      <w:tblGrid>
-        <w:gridCol w:w="9000"/>
-      </w:tblGrid>
-      <w:tr>
-        <w:tc>
-          <w:tcPr>
-            <w:tcW w:w="9000" w:type="dxa"/>
-            <w:shd w:val="clear" w:color="auto" w:fill="EDEDED"/>
-          </w:tcPr>
-          <w:p>
-            <w:pPr>
-              <w:jc w:val="both"/>
-              <w:rPr>
-                <w:rFonts w:ascii="Times New Roman" w:hAnsi="Times New Roman" w:cs="Times New Roman"/>
-                <w:lang w:val="tr-TR"/>
-              </w:rPr>
-            </w:pPr>
-            <w:r>
-              <w:rPr>
-                <w:rFonts w:ascii="Times New Roman" w:hAnsi="Times New Roman" w:cs="Times New Roman"/>
-                <w:lang w:val="tr-TR"/>
-              </w:rPr>
-              <w:t xml:space="preserve">GÖRSEL ALANI (Shutterstock)</w:t>
-            </w:r>
-          </w:p>
-          <w:p>
-            <w:pPr>
-              <w:jc w:val="both"/>
-              <w:rPr>
-                <w:rFonts w:ascii="Times New Roman" w:hAnsi="Times New Roman" w:cs="Times New Roman"/>
-                <w:lang w:val="tr-TR"/>
-              </w:rPr>
-            </w:pPr>
-            <w:r>
-              <w:rPr>
-                <w:rFonts w:ascii="Times New Roman" w:hAnsi="Times New Roman" w:cs="Times New Roman"/>
-                <w:lang w:val="tr-TR"/>
-              </w:rPr>
-              <w:t xml:space="preserve">Tarif: Evde organik atık, plastik, kâğıt ve cam atıkların ayrı kaplarda toplandığı bir mutfak ya da geri dönüşüm kutuları.</w:t>
-            </w:r>
-          </w:p>
-          <w:p>
-            <w:pPr>
-              <w:jc w:val="both"/>
-              <w:rPr>
-                <w:rFonts w:ascii="Times New Roman" w:hAnsi="Times New Roman" w:cs="Times New Roman"/>
-                <w:lang w:val="tr-TR"/>
-              </w:rPr>
-            </w:pPr>
-            <w:r>
-              <w:rPr>
-                <w:rFonts w:ascii="Times New Roman" w:hAnsi="Times New Roman" w:cs="Times New Roman"/>
-                <w:lang w:val="tr-TR"/>
-              </w:rPr>
-              <w:t xml:space="preserve">Shutter ID: 2470794031 (fotoğraf) — Household bins for waste sorting in the kitchen</w:t>
-            </w:r>
-          </w:p>
-        </w:tc>
-      </w:tr>
-    </w:tbl>
-    <w:p>
-      <w:pPr>
-        <w:jc w:val="both"/>
-        <w:rPr>
-          <w:rFonts w:ascii="Times New Roman" w:hAnsi="Times New Roman" w:cs="Times New Roman"/>
-          <w:lang w:val="tr-TR"/>
-        </w:rPr>
-      </w:pPr>
+      </w:pPr>
+      <w:r>
+        <w:rPr>
+          <w:rFonts w:ascii="Times New Roman" w:hAnsi="Times New Roman" w:cs="Times New Roman"/>
+          <w:b/>
+          <w:bCs/>
+          <w:highlight w:val="yellow"/>
+          <w:lang w:val="tr-TR"/>
+        </w:rPr>
+        <w:t xml:space="preserve">Shutter id: 4198128129 (bölüm kapağı, tam sayfa)</w:t>
+      </w:r>
+    </w:p>
+    <w:p>
+      <w:pPr>
+        <w:jc w:val="center"/>
+      </w:pPr>
+      <w:r>
+        <w:drawing>
+          <wp:inline xmlns:a="http://schemas.openxmlformats.org/drawingml/2006/main" xmlns:pic="http://schemas.openxmlformats.org/drawingml/2006/picture">
+            <wp:extent cx="3436363" cy="2520000"/>
+            <wp:docPr id="900015" name="Picture 900015"/>
+            <wp:cNvGraphicFramePr>
+              <a:graphicFrameLocks noChangeAspect="1"/>
+            </wp:cNvGraphicFramePr>
+            <a:graphic>
+              <a:graphicData uri="http://schemas.openxmlformats.org/drawingml/2006/picture">
+                <pic:pic>
+                  <pic:nvPicPr>
+                    <pic:cNvPr id="0" name="2470794031_d.jpg"/>
+                    <pic:cNvPicPr/>
+                  </pic:nvPicPr>
+                  <pic:blipFill>
+                    <a:blip r:embed="rId15"/>
+                    <a:stretch>
+                      <a:fillRect/>
+                    </a:stretch>
+                  </pic:blipFill>
+                  <pic:spPr>
+                    <a:xfrm>
+                      <a:off x="0" y="0"/>
+                      <a:ext cx="3436363" cy="2520000"/>
+                    </a:xfrm>
+                    <a:prstGeom prst="rect"/>
+                  </pic:spPr>
+                </pic:pic>
+              </a:graphicData>
+            </a:graphic>
+          </wp:inline>
+        </w:drawing>
+      </w:r>
+    </w:p>
+    <w:p>
+      <w:pPr>
+        <w:jc w:val="center"/>
+      </w:pPr>
+      <w:r>
+        <w:rPr>
+          <w:rFonts w:ascii="Times New Roman" w:hAnsi="Times New Roman" w:cs="Times New Roman"/>
+          <w:b/>
+          <w:bCs/>
+          <w:highlight w:val="yellow"/>
+          <w:lang w:val="tr-TR"/>
+        </w:rPr>
+        <w:t xml:space="preserve">Shutter id: 2470794031</w:t>
+      </w:r>
     </w:p>
     <w:p>
       <w:pPr>
@@ -1409,77 +1331,60 @@
           <w:tcPr>
             <w:tcW w:w="4500" w:type="dxa"/>
           </w:tcPr>
-          <w:tbl>
-            <w:tblPr>
-              <w:tblW w:w="4300" w:type="dxa"/>
+          <w:p>
+            <w:pPr>
               <w:jc w:val="center"/>
-              <w:tblBorders>
-                <w:top w:val="single" w:sz="8" w:space="0" w:color="7F7F7F"/>
-                <w:left w:val="single" w:sz="8" w:space="0" w:color="7F7F7F"/>
-                <w:bottom w:val="single" w:sz="8" w:space="0" w:color="7F7F7F"/>
-                <w:right w:val="single" w:sz="8" w:space="0" w:color="7F7F7F"/>
-              </w:tblBorders>
-            </w:tblPr>
-            <w:tblGrid>
-              <w:gridCol w:w="4300"/>
-            </w:tblGrid>
-            <w:tr>
-              <w:tc>
-                <w:tcPr>
-                  <w:tcW w:w="4300" w:type="dxa"/>
-                  <w:shd w:val="clear" w:color="auto" w:fill="EDEDED"/>
-                </w:tcPr>
-                <w:p>
-                  <w:pPr>
-                    <w:jc w:val="both"/>
-                    <w:rPr>
-                      <w:rFonts w:ascii="Times New Roman" w:hAnsi="Times New Roman" w:cs="Times New Roman"/>
-                      <w:lang w:val="tr-TR"/>
-                    </w:rPr>
-                  </w:pPr>
-                  <w:r>
-                    <w:rPr>
-                      <w:rFonts w:ascii="Times New Roman" w:hAnsi="Times New Roman" w:cs="Times New Roman"/>
-                      <w:lang w:val="tr-TR"/>
-                    </w:rPr>
-                    <w:t xml:space="preserve">GÖRSEL ALANI (Shutterstock)</w:t>
-                  </w:r>
-                </w:p>
-                <w:p>
-                  <w:pPr>
-                    <w:jc w:val="both"/>
-                    <w:rPr>
-                      <w:rFonts w:ascii="Times New Roman" w:hAnsi="Times New Roman" w:cs="Times New Roman"/>
-                      <w:lang w:val="tr-TR"/>
-                    </w:rPr>
-                  </w:pPr>
-                  <w:r>
-                    <w:rPr>
-                      <w:rFonts w:ascii="Times New Roman" w:hAnsi="Times New Roman" w:cs="Times New Roman"/>
-                      <w:lang w:val="tr-TR"/>
-                    </w:rPr>
-                    <w:t xml:space="preserve">Tarif: Kompost kabında sebze-meyve kabukları, ekmek artıkları ve yemek atıkları.</w:t>
-                  </w:r>
-                </w:p>
-                <w:p>
-                  <w:pPr>
-                    <w:jc w:val="both"/>
-                    <w:rPr>
-                      <w:rFonts w:ascii="Times New Roman" w:hAnsi="Times New Roman" w:cs="Times New Roman"/>
-                      <w:lang w:val="tr-TR"/>
-                    </w:rPr>
-                  </w:pPr>
-                  <w:r>
-                    <w:rPr>
-                      <w:rFonts w:ascii="Times New Roman" w:hAnsi="Times New Roman" w:cs="Times New Roman"/>
-                      <w:lang w:val="tr-TR"/>
-                    </w:rPr>
-                    <w:t xml:space="preserve">Shutter ID: 2723825975 (fotoğraf) — Compost heap with kitchen scraps</w:t>
-                  </w:r>
-                </w:p>
-              </w:tc>
-            </w:tr>
-          </w:tbl>
+            </w:pPr>
+            <w:r>
+              <w:drawing>
+                <wp:inline xmlns:a="http://schemas.openxmlformats.org/drawingml/2006/main" xmlns:pic="http://schemas.openxmlformats.org/drawingml/2006/picture">
+                  <wp:extent cx="2664000" cy="1957152"/>
+                  <wp:docPr id="900016" name="Picture 900016"/>
+                  <wp:cNvGraphicFramePr>
+                    <a:graphicFrameLocks noChangeAspect="1"/>
+                  </wp:cNvGraphicFramePr>
+                  <a:graphic>
+                    <a:graphicData uri="http://schemas.openxmlformats.org/drawingml/2006/picture">
+                      <pic:pic>
+                        <pic:nvPicPr>
+                          <pic:cNvPr id="0" name="2723825975_d.jpg"/>
+                          <pic:cNvPicPr/>
+                        </pic:nvPicPr>
+                        <pic:blipFill>
+                          <a:blip r:embed="rId16"/>
+                          <a:stretch>
+                            <a:fillRect/>
+                          </a:stretch>
+                        </pic:blipFill>
+                        <pic:spPr>
+                          <a:xfrm>
+                            <a:off x="0" y="0"/>
+                            <a:ext cx="2664000" cy="1957152"/>
+                          </a:xfrm>
+                          <a:prstGeom prst="rect"/>
+                        </pic:spPr>
+                      </pic:pic>
+                    </a:graphicData>
+                  </a:graphic>
+                </wp:inline>
+              </w:drawing>
+            </w:r>
+          </w:p>
+          <w:p>
+            <w:pPr>
+              <w:jc w:val="center"/>
+            </w:pPr>
+            <w:r>
+              <w:rPr>
+                <w:rFonts w:ascii="Times New Roman" w:hAnsi="Times New Roman" w:cs="Times New Roman"/>
+                <w:b/>
+                <w:bCs/>
+                <w:highlight w:val="yellow"/>
+                <w:lang w:val="tr-TR"/>
+              </w:rPr>
+              <w:t xml:space="preserve">Shutter id: 2723825975</w:t>
+            </w:r>
+          </w:p>
           <w:p>
             <w:pPr>
               <w:jc w:val="center"/>
@@ -6173,85 +6078,59 @@
         </w:rPr>
       </w:pPr>
     </w:p>
-    <w:tbl>
-      <w:tblPr>
-        <w:tblW w:w="9000" w:type="dxa"/>
+    <w:p>
+      <w:pPr>
         <w:jc w:val="center"/>
-        <w:tblBorders>
-          <w:top w:val="single" w:sz="8" w:space="0" w:color="7F7F7F"/>
-          <w:left w:val="single" w:sz="8" w:space="0" w:color="7F7F7F"/>
-          <w:bottom w:val="single" w:sz="8" w:space="0" w:color="7F7F7F"/>
-          <w:right w:val="single" w:sz="8" w:space="0" w:color="7F7F7F"/>
-        </w:tblBorders>
-      </w:tblPr>
-      <w:tblGrid>
-        <w:gridCol w:w="9000"/>
-      </w:tblGrid>
-      <w:tr>
-        <w:tc>
-          <w:tcPr>
-            <w:tcW w:w="9000" w:type="dxa"/>
-            <w:shd w:val="clear" w:color="auto" w:fill="EDEDED"/>
-          </w:tcPr>
-          <w:p>
-            <w:pPr>
-              <w:jc w:val="both"/>
-              <w:rPr>
-                <w:rFonts w:ascii="Times New Roman" w:hAnsi="Times New Roman" w:cs="Times New Roman"/>
-                <w:lang w:val="tr-TR"/>
-              </w:rPr>
-            </w:pPr>
-            <w:r>
-              <w:rPr>
-                <w:rFonts w:ascii="Times New Roman" w:hAnsi="Times New Roman" w:cs="Times New Roman"/>
-                <w:lang w:val="tr-TR"/>
-              </w:rPr>
-              <w:t xml:space="preserve">GÖRSEL ALANI (Shutterstock)</w:t>
-            </w:r>
-          </w:p>
-          <w:p>
-            <w:pPr>
-              <w:jc w:val="both"/>
-              <w:rPr>
-                <w:rFonts w:ascii="Times New Roman" w:hAnsi="Times New Roman" w:cs="Times New Roman"/>
-                <w:lang w:val="tr-TR"/>
-              </w:rPr>
-            </w:pPr>
-            <w:r>
-              <w:rPr>
-                <w:rFonts w:ascii="Times New Roman" w:hAnsi="Times New Roman" w:cs="Times New Roman"/>
-                <w:lang w:val="tr-TR"/>
-              </w:rPr>
-              <w:t xml:space="preserve">Tarif: Güneş paneli ve rüzgâr türbininden gelen elektrikle çalışan elektrolizör, hidrojen depolama tankı ve yakıt pilli araç akışı (vektörel, düzenlenebilir).</w:t>
-            </w:r>
-          </w:p>
-          <w:p>
-            <w:pPr>
-              <w:jc w:val="both"/>
-              <w:rPr>
-                <w:rFonts w:ascii="Times New Roman" w:hAnsi="Times New Roman" w:cs="Times New Roman"/>
-                <w:lang w:val="tr-TR"/>
-              </w:rPr>
-            </w:pPr>
-            <w:r>
-              <w:rPr>
-                <w:rFonts w:ascii="Times New Roman" w:hAnsi="Times New Roman" w:cs="Times New Roman"/>
-                <w:lang w:val="tr-TR"/>
-              </w:rPr>
-              <w:t xml:space="preserve">Shutter ID: 2446755651 (vektör) — Green hydrogen energy production. Scheme of H2 production</w:t>
-            </w:r>
-          </w:p>
-        </w:tc>
-      </w:tr>
-    </w:tbl>
-    <w:p>
-      <w:pPr>
-        <w:jc w:val="both"/>
-        <w:rPr>
-          <w:rFonts w:ascii="Times New Roman" w:hAnsi="Times New Roman" w:cs="Times New Roman"/>
-          <w:lang w:val="tr-TR"/>
-        </w:rPr>
-      </w:pPr>
+      </w:pPr>
+      <w:r>
+        <w:drawing>
+          <wp:inline xmlns:a="http://schemas.openxmlformats.org/drawingml/2006/main" xmlns:pic="http://schemas.openxmlformats.org/drawingml/2006/picture">
+            <wp:extent cx="5040000" cy="2224320"/>
+            <wp:docPr id="900017" name="Picture 900017"/>
+            <wp:cNvGraphicFramePr>
+              <a:graphicFrameLocks noChangeAspect="1"/>
+            </wp:cNvGraphicFramePr>
+            <a:graphic>
+              <a:graphicData uri="http://schemas.openxmlformats.org/drawingml/2006/picture">
+                <pic:pic>
+                  <pic:nvPicPr>
+                    <pic:cNvPr id="0" name="2446755651_d.jpg"/>
+                    <pic:cNvPicPr/>
+                  </pic:nvPicPr>
+                  <pic:blipFill>
+                    <a:blip r:embed="rId17"/>
+                    <a:stretch>
+                      <a:fillRect/>
+                    </a:stretch>
+                  </pic:blipFill>
+                  <pic:spPr>
+                    <a:xfrm>
+                      <a:off x="0" y="0"/>
+                      <a:ext cx="5040000" cy="2224320"/>
+                    </a:xfrm>
+                    <a:prstGeom prst="rect"/>
+                  </pic:spPr>
+                </pic:pic>
+              </a:graphicData>
+            </a:graphic>
+          </wp:inline>
+        </w:drawing>
+      </w:r>
+    </w:p>
+    <w:p>
+      <w:pPr>
+        <w:jc w:val="center"/>
+      </w:pPr>
+      <w:r>
+        <w:rPr>
+          <w:rFonts w:ascii="Times New Roman" w:hAnsi="Times New Roman" w:cs="Times New Roman"/>
+          <w:b/>
+          <w:bCs/>
+          <w:highlight w:val="yellow"/>
+          <w:lang w:val="tr-TR"/>
+        </w:rPr>
+        <w:t xml:space="preserve">Shutter id: 2446755651</w:t>
+      </w:r>
     </w:p>
     <w:p>
       <w:pPr>

</xml_diff>

<commit_message>
3.1: bolum girisindeki atik ayristirma gorseli cift gorsele cikarildi (Gorsel C cop depolama alani, Shutter 2760312959); sonraki gorsel harfleri ve atiflar kaydirildi
</commit_message>
<xml_diff>
--- a/Kim11-3-1-Yesil-Hidrojen.docx
+++ b/Kim11-3-1-Yesil-Hidrojen.docx
@@ -354,99 +354,209 @@
         <w:t xml:space="preserve">Shutter id: 4198128129 (bölüm kapağı, tam sayfa)</w:t>
       </w:r>
     </w:p>
-    <w:p>
-      <w:pPr>
+    <w:tbl>
+      <w:tblPr>
+        <w:tblW w:w="9000" w:type="dxa"/>
         <w:jc w:val="center"/>
-      </w:pPr>
-      <w:r>
-        <w:drawing>
-          <wp:inline xmlns:a="http://schemas.openxmlformats.org/drawingml/2006/main" xmlns:pic="http://schemas.openxmlformats.org/drawingml/2006/picture">
-            <wp:extent cx="3436363" cy="2520000"/>
-            <wp:docPr id="900015" name="Picture 900015"/>
-            <wp:cNvGraphicFramePr>
-              <a:graphicFrameLocks noChangeAspect="1"/>
-            </wp:cNvGraphicFramePr>
-            <a:graphic>
-              <a:graphicData uri="http://schemas.openxmlformats.org/drawingml/2006/picture">
-                <pic:pic>
-                  <pic:nvPicPr>
-                    <pic:cNvPr id="0" name="2470794031_d.jpg"/>
-                    <pic:cNvPicPr/>
-                  </pic:nvPicPr>
-                  <pic:blipFill>
-                    <a:blip r:embed="rId15"/>
-                    <a:stretch>
-                      <a:fillRect/>
-                    </a:stretch>
-                  </pic:blipFill>
-                  <pic:spPr>
-                    <a:xfrm>
-                      <a:off x="0" y="0"/>
-                      <a:ext cx="3436363" cy="2520000"/>
-                    </a:xfrm>
-                    <a:prstGeom prst="rect"/>
-                  </pic:spPr>
-                </pic:pic>
-              </a:graphicData>
-            </a:graphic>
-          </wp:inline>
-        </w:drawing>
-      </w:r>
-    </w:p>
-    <w:p>
-      <w:pPr>
-        <w:jc w:val="center"/>
-      </w:pPr>
-      <w:r>
-        <w:rPr>
-          <w:rFonts w:ascii="Times New Roman" w:hAnsi="Times New Roman" w:cs="Times New Roman"/>
-          <w:b/>
-          <w:bCs/>
-          <w:highlight w:val="yellow"/>
-          <w:lang w:val="tr-TR"/>
-        </w:rPr>
-        <w:t xml:space="preserve">Shutter id: 2470794031</w:t>
-      </w:r>
-    </w:p>
-    <w:p>
-      <w:pPr>
-        <w:jc w:val="center"/>
-        <w:rPr>
-          <w:rFonts w:ascii="Times New Roman" w:hAnsi="Times New Roman" w:cs="Times New Roman"/>
-          <w:lang w:val="tr-TR"/>
-        </w:rPr>
-      </w:pPr>
-      <w:r>
-        <w:rPr>
-          <w:rFonts w:ascii="Times New Roman" w:hAnsi="Times New Roman" w:cs="Times New Roman"/>
-          <w:b/>
-          <w:bCs/>
-          <w:lang w:val="tr-TR"/>
-        </w:rPr>
-        <w:t xml:space="preserve">Görsel B:</w:t>
-      </w:r>
-      <w:r>
-        <w:rPr>
-          <w:rFonts w:ascii="Times New Roman" w:hAnsi="Times New Roman" w:cs="Times New Roman"/>
-          <w:lang w:val="tr-TR"/>
-        </w:rPr>
-        <w:t xml:space="preserve"> Atık ayrıştırma</w:t>
-      </w:r>
-    </w:p>
-    <w:p>
-      <w:pPr>
-        <w:jc w:val="both"/>
-        <w:rPr>
-          <w:rFonts w:ascii="Times New Roman" w:hAnsi="Times New Roman" w:cs="Times New Roman"/>
-          <w:lang w:val="tr-TR"/>
-        </w:rPr>
-      </w:pPr>
-      <w:r>
-        <w:rPr>
-          <w:rFonts w:ascii="Times New Roman" w:hAnsi="Times New Roman" w:cs="Times New Roman"/>
-          <w:lang w:val="tr-TR"/>
-        </w:rPr>
-        <w:t xml:space="preserve">Her gün evlerimizde sebze ve meyve kabukları, ekmek artıkları ve yemek atıkları gibi çok miktarda organik atık oluşur (Görsel B). Bu atıkların büyük bir kısmı çöp depolama alanlarına gönderilir ve burada bozunarak sera gazlarının oluşmasına katkıda bulunur. Oysa aynı atıklar uygun koşullarda mikroorganizmalar yardımıyla temiz bir yakıt olan hidrojen gazına dönüştürülebilir.</w:t>
+        <w:tblBorders>
+          <w:top w:val="nil"/>
+          <w:left w:val="nil"/>
+          <w:bottom w:val="nil"/>
+          <w:right w:val="nil"/>
+          <w:insideH w:val="nil"/>
+          <w:insideV w:val="nil"/>
+        </w:tblBorders>
+        <w:tblLayout w:type="fixed"/>
+      </w:tblPr>
+      <w:tblGrid>
+        <w:gridCol w:w="4500"/>
+        <w:gridCol w:w="4500"/>
+      </w:tblGrid>
+      <w:tr>
+        <w:tc>
+          <w:tcPr>
+            <w:tcW w:w="4500" w:type="dxa"/>
+          </w:tcPr>
+          <w:p>
+            <w:pPr>
+              <w:jc w:val="center"/>
+            </w:pPr>
+            <w:r>
+              <w:drawing>
+                <wp:inline xmlns:a="http://schemas.openxmlformats.org/drawingml/2006/main" xmlns:pic="http://schemas.openxmlformats.org/drawingml/2006/picture">
+                  <wp:extent cx="2628000" cy="1927200"/>
+                  <wp:docPr id="900015" name="Picture 900015"/>
+                  <wp:cNvGraphicFramePr>
+                    <a:graphicFrameLocks noChangeAspect="1"/>
+                  </wp:cNvGraphicFramePr>
+                  <a:graphic>
+                    <a:graphicData uri="http://schemas.openxmlformats.org/drawingml/2006/picture">
+                      <pic:pic>
+                        <pic:nvPicPr>
+                          <pic:cNvPr id="0" name="2470794031_d.jpg"/>
+                          <pic:cNvPicPr/>
+                        </pic:nvPicPr>
+                        <pic:blipFill>
+                          <a:blip r:embed="rId15"/>
+                          <a:stretch>
+                            <a:fillRect/>
+                          </a:stretch>
+                        </pic:blipFill>
+                        <pic:spPr>
+                          <a:xfrm>
+                            <a:off x="0" y="0"/>
+                            <a:ext cx="2628000" cy="1927200"/>
+                          </a:xfrm>
+                          <a:prstGeom prst="rect"/>
+                        </pic:spPr>
+                      </pic:pic>
+                    </a:graphicData>
+                  </a:graphic>
+                </wp:inline>
+              </w:drawing>
+            </w:r>
+          </w:p>
+          <w:p>
+            <w:pPr>
+              <w:jc w:val="center"/>
+            </w:pPr>
+            <w:r>
+              <w:rPr>
+                <w:rFonts w:ascii="Times New Roman" w:hAnsi="Times New Roman" w:cs="Times New Roman"/>
+                <w:b/>
+                <w:bCs/>
+                <w:highlight w:val="yellow"/>
+                <w:lang w:val="tr-TR"/>
+              </w:rPr>
+              <w:t xml:space="preserve">Shutter id: 2470794031</w:t>
+            </w:r>
+          </w:p>
+          <w:p>
+            <w:pPr>
+              <w:jc w:val="center"/>
+              <w:rPr>
+                <w:rFonts w:ascii="Times New Roman" w:hAnsi="Times New Roman" w:cs="Times New Roman"/>
+                <w:lang w:val="tr-TR"/>
+              </w:rPr>
+            </w:pPr>
+            <w:r>
+              <w:rPr>
+                <w:rFonts w:ascii="Times New Roman" w:hAnsi="Times New Roman" w:cs="Times New Roman"/>
+                <w:b/>
+                <w:bCs/>
+                <w:lang w:val="tr-TR"/>
+              </w:rPr>
+              <w:t xml:space="preserve">Görsel B:</w:t>
+            </w:r>
+            <w:r>
+              <w:rPr>
+                <w:rFonts w:ascii="Times New Roman" w:hAnsi="Times New Roman" w:cs="Times New Roman"/>
+                <w:lang w:val="tr-TR"/>
+              </w:rPr>
+              <w:t xml:space="preserve"> Atık ayrıştırma</w:t>
+            </w:r>
+          </w:p>
+        </w:tc>
+        <w:tc>
+          <w:tcPr>
+            <w:tcW w:w="4500" w:type="dxa"/>
+          </w:tcPr>
+          <w:p>
+            <w:pPr>
+              <w:jc w:val="center"/>
+            </w:pPr>
+            <w:r>
+              <w:drawing>
+                <wp:inline xmlns:a="http://schemas.openxmlformats.org/drawingml/2006/main" xmlns:pic="http://schemas.openxmlformats.org/drawingml/2006/picture">
+                  <wp:extent cx="2628000" cy="1657392"/>
+                  <wp:docPr id="900018" name="Picture 900018"/>
+                  <wp:cNvGraphicFramePr>
+                    <a:graphicFrameLocks noChangeAspect="1"/>
+                  </wp:cNvGraphicFramePr>
+                  <a:graphic>
+                    <a:graphicData uri="http://schemas.openxmlformats.org/drawingml/2006/picture">
+                      <pic:pic>
+                        <pic:nvPicPr>
+                          <pic:cNvPr id="0" name="2760312959_d.jpg"/>
+                          <pic:cNvPicPr/>
+                        </pic:nvPicPr>
+                        <pic:blipFill>
+                          <a:blip r:embed="rId18"/>
+                          <a:stretch>
+                            <a:fillRect/>
+                          </a:stretch>
+                        </pic:blipFill>
+                        <pic:spPr>
+                          <a:xfrm>
+                            <a:off x="0" y="0"/>
+                            <a:ext cx="2628000" cy="1657392"/>
+                          </a:xfrm>
+                          <a:prstGeom prst="rect"/>
+                        </pic:spPr>
+                      </pic:pic>
+                    </a:graphicData>
+                  </a:graphic>
+                </wp:inline>
+              </w:drawing>
+            </w:r>
+          </w:p>
+          <w:p>
+            <w:pPr>
+              <w:jc w:val="center"/>
+            </w:pPr>
+            <w:r>
+              <w:rPr>
+                <w:rFonts w:ascii="Times New Roman" w:hAnsi="Times New Roman" w:cs="Times New Roman"/>
+                <w:b/>
+                <w:bCs/>
+                <w:highlight w:val="yellow"/>
+                <w:lang w:val="tr-TR"/>
+              </w:rPr>
+              <w:t xml:space="preserve">Shutter id: 2760312959</w:t>
+            </w:r>
+          </w:p>
+          <w:p>
+            <w:pPr>
+              <w:jc w:val="center"/>
+              <w:rPr>
+                <w:rFonts w:ascii="Times New Roman" w:hAnsi="Times New Roman" w:cs="Times New Roman"/>
+                <w:lang w:val="tr-TR"/>
+              </w:rPr>
+            </w:pPr>
+            <w:r>
+              <w:rPr>
+                <w:rFonts w:ascii="Times New Roman" w:hAnsi="Times New Roman" w:cs="Times New Roman"/>
+                <w:b/>
+                <w:bCs/>
+                <w:lang w:val="tr-TR"/>
+              </w:rPr>
+              <w:t xml:space="preserve">Görsel C:</w:t>
+            </w:r>
+            <w:r>
+              <w:rPr>
+                <w:rFonts w:ascii="Times New Roman" w:hAnsi="Times New Roman" w:cs="Times New Roman"/>
+                <w:lang w:val="tr-TR"/>
+              </w:rPr>
+              <w:t xml:space="preserve"> Çöp depolama alanı</w:t>
+            </w:r>
+          </w:p>
+        </w:tc>
+      </w:tr>
+    </w:tbl>
+    <w:p>
+      <w:pPr>
+        <w:jc w:val="both"/>
+        <w:rPr>
+          <w:rFonts w:ascii="Times New Roman" w:hAnsi="Times New Roman" w:cs="Times New Roman"/>
+          <w:lang w:val="tr-TR"/>
+        </w:rPr>
+      </w:pPr>
+      <w:r>
+        <w:rPr>
+          <w:rFonts w:ascii="Times New Roman" w:hAnsi="Times New Roman" w:cs="Times New Roman"/>
+          <w:lang w:val="tr-TR"/>
+        </w:rPr>
+        <w:t xml:space="preserve">Her gün evlerimizde sebze ve meyve kabukları, ekmek artıkları ve yemek atıkları gibi çok miktarda organik atık oluşur (Görsel B). Bu atıkların büyük bir kısmı çöp depolama alanlarına gönderilir (Görsel C) ve burada bozunarak sera gazlarının oluşmasına katkıda bulunur. Oysa aynı atıklar uygun koşullarda mikroorganizmalar yardımıyla temiz bir yakıt olan hidrojen gazına dönüştürülebilir.</w:t>
       </w:r>
     </w:p>
     <w:p>
@@ -1221,7 +1331,7 @@
           <w:rFonts w:ascii="Times New Roman" w:hAnsi="Times New Roman" w:cs="Times New Roman"/>
           <w:lang w:val="tr-TR"/>
         </w:rPr>
-        <w:t xml:space="preserve">Hidrojen, yandığında yalnızca su oluşturan ve birim kütle başına en fazla enerji açığa çıkaran yakıtlardan biridir. 1. temada hidrojenin yanma tepkimesini ve enerji kaynağı olma potansiyelini incelemiştiniz. Ülkemizde Birleşmiş Milletler Sınai Kalkınma Örgütü (UNIDO) bünyesinde kurulan Uluslararası Hidrojen Enerjisi Teknolojileri Merkezi (ICHET) tarafından İstanbul’da Gezici Hidrojen Evi, Yakıt Pilli Yolcu Taşıma Aracı, Hidrojen Yakıt Pilli Forklift ve İDO Yakıt Pilli Kesintisiz Güç Kaynağı gibi projeler uygulamaya konulmuştur (Görsel C). Bu projelerde hidrojen nasıl kullanılmış olabilir? Hidrojen gazı evlerimizden çıkan atıklardan (Görsel D) elde edilebilir mi? Bu soruların cevabını Analiz ve Keşif Atölyesi 3.1.’deki etkinliği yaparak keşfediniz. Bu etkinlikte gaz miktarını etkileyebilecek faktörlere yönelik araştırma soruları yazacak, değişkenlerinizi belirleyecek ve deneyden önce sonucu öngören hipotezler oluşturacaksınız. Ardından hipotezlerinizi kendi kurduğunuz düzeneklerden elde ettiğiniz verilerle sınayacaksınız. Grubunuzla adım adım ve planlı çalışırken iş birliği yapacak, atıkları değerli bir kaynağa dönüştürmeyi düşünerek çevreye duyarlılık ve temizlik değerlerini de destekleyeceksiniz.</w:t>
+        <w:t xml:space="preserve">Hidrojen, yandığında yalnızca su oluşturan ve birim kütle başına en fazla enerji açığa çıkaran yakıtlardan biridir. 1. temada hidrojenin yanma tepkimesini ve enerji kaynağı olma potansiyelini incelemiştiniz. Ülkemizde Birleşmiş Milletler Sınai Kalkınma Örgütü (UNIDO) bünyesinde kurulan Uluslararası Hidrojen Enerjisi Teknolojileri Merkezi (ICHET) tarafından İstanbul’da Gezici Hidrojen Evi, Yakıt Pilli Yolcu Taşıma Aracı, Hidrojen Yakıt Pilli Forklift ve İDO Yakıt Pilli Kesintisiz Güç Kaynağı gibi projeler uygulamaya konulmuştur (Görsel D). Bu projelerde hidrojen nasıl kullanılmış olabilir? Hidrojen gazı evlerimizden çıkan atıklardan (Görsel E) elde edilebilir mi? Bu soruların cevabını Analiz ve Keşif Atölyesi 3.1.’deki etkinliği yaparak keşfediniz. Bu etkinlikte gaz miktarını etkileyebilecek faktörlere yönelik araştırma soruları yazacak, değişkenlerinizi belirleyecek ve deneyden önce sonucu öngören hipotezler oluşturacaksınız. Ardından hipotezlerinizi kendi kurduğunuz düzeneklerden elde ettiğiniz verilerle sınayacaksınız. Grubunuzla adım adım ve planlı çalışırken iş birliği yapacak, atıkları değerli bir kaynağa dönüştürmeyi düşünerek çevreye duyarlılık ve temizlik değerlerini de destekleyeceksiniz.</w:t>
       </w:r>
     </w:p>
     <w:tbl>
@@ -1316,7 +1426,7 @@
                 <w:bCs/>
                 <w:lang w:val="tr-TR"/>
               </w:rPr>
-              <w:t xml:space="preserve">Görsel C:</w:t>
+              <w:t xml:space="preserve">Görsel D:</w:t>
             </w:r>
             <w:r>
               <w:rPr>
@@ -1400,7 +1510,7 @@
                 <w:bCs/>
                 <w:lang w:val="tr-TR"/>
               </w:rPr>
-              <w:t xml:space="preserve">Görsel D:</w:t>
+              <w:t xml:space="preserve">Görsel E:</w:t>
             </w:r>
             <w:r>
               <w:rPr>

</xml_diff>

<commit_message>
3.1 Kopru Kurma Atolyesi 3.1: atik gorselinin yanina evde atik ayristirma fotografi eklendi (cift gorsel), ceviri notu ve giris cumlesi guncellendi
</commit_message>
<xml_diff>
--- a/Kim11-3-1-Yesil-Hidrojen.docx
+++ b/Kim11-3-1-Yesil-Hidrojen.docx
@@ -966,86 +966,209 @@
           <w:rFonts w:ascii="Times New Roman" w:hAnsi="Times New Roman" w:cs="Times New Roman"/>
           <w:lang w:val="tr-TR"/>
         </w:rPr>
-        <w:t xml:space="preserve">Bir ailenin bir haftada ürettiği atıklar aşağıdaki görselde verilmiştir.</w:t>
-      </w:r>
-    </w:p>
-    <w:p>
-      <w:pPr>
+        <w:t xml:space="preserve">Bir ailenin bir haftada ürettiği atıklar ve bu atıkların evde ayrıştırılması aşağıdaki görsellerde verilmiştir.</w:t>
+      </w:r>
+    </w:p>
+    <w:tbl>
+      <w:tblPr>
+        <w:tblW w:w="9000" w:type="dxa"/>
         <w:jc w:val="center"/>
-      </w:pPr>
-      <w:r>
-        <w:drawing>
-          <wp:inline xmlns:a="http://schemas.openxmlformats.org/drawingml/2006/main" xmlns:pic="http://schemas.openxmlformats.org/drawingml/2006/picture">
-            <wp:extent cx="3433242" cy="2520000"/>
-            <wp:docPr id="900011" name="Picture 900011"/>
-            <wp:cNvGraphicFramePr>
-              <a:graphicFrameLocks noChangeAspect="1"/>
-            </wp:cNvGraphicFramePr>
-            <a:graphic>
-              <a:graphicData uri="http://schemas.openxmlformats.org/drawingml/2006/picture">
-                <pic:pic>
-                  <pic:nvPicPr>
-                    <pic:cNvPr id="0" name="1576281232_d.jpg"/>
-                    <pic:cNvPicPr/>
-                  </pic:nvPicPr>
-                  <pic:blipFill>
-                    <a:blip r:embed="rId11"/>
-                    <a:stretch>
-                      <a:fillRect/>
-                    </a:stretch>
-                  </pic:blipFill>
-                  <pic:spPr>
-                    <a:xfrm>
-                      <a:off x="0" y="0"/>
-                      <a:ext cx="3433242" cy="2520000"/>
-                    </a:xfrm>
-                    <a:prstGeom prst="rect"/>
-                  </pic:spPr>
-                </pic:pic>
-              </a:graphicData>
-            </a:graphic>
-          </wp:inline>
-        </w:drawing>
-      </w:r>
-    </w:p>
-    <w:p>
-      <w:pPr>
-        <w:jc w:val="center"/>
-      </w:pPr>
-      <w:r>
-        <w:rPr>
-          <w:rFonts w:ascii="Times New Roman" w:hAnsi="Times New Roman" w:cs="Times New Roman"/>
-          <w:b/>
-          <w:bCs/>
-          <w:highlight w:val="yellow"/>
-          <w:lang w:val="tr-TR"/>
-        </w:rPr>
-        <w:t xml:space="preserve">Shutter id: 1576281232</w:t>
-      </w:r>
-    </w:p>
-    <w:p>
-      <w:pPr>
-        <w:jc w:val="center"/>
-        <w:rPr>
-          <w:rFonts w:ascii="Times New Roman" w:hAnsi="Times New Roman" w:cs="Times New Roman"/>
-          <w:lang w:val="tr-TR"/>
-        </w:rPr>
-      </w:pPr>
-      <w:r>
-        <w:rPr>
-          <w:rFonts w:ascii="Times New Roman" w:hAnsi="Times New Roman" w:cs="Times New Roman"/>
-          <w:lang w:val="tr-TR"/>
-        </w:rPr>
-        <w:t xml:space="preserve">Bir ailenin haftalık evsel atıkları</w:t>
-      </w:r>
-      <w:r>
-        <w:rPr>
-          <w:rFonts w:ascii="Times New Roman" w:hAnsi="Times New Roman" w:cs="Times New Roman"/>
-          <w:lang w:val="tr-TR"/>
-        </w:rPr>
-        <w:t xml:space="preserve"/>
-      </w:r>
-    </w:p>
+        <w:tblBorders>
+          <w:top w:val="nil"/>
+          <w:left w:val="nil"/>
+          <w:bottom w:val="nil"/>
+          <w:right w:val="nil"/>
+          <w:insideH w:val="nil"/>
+          <w:insideV w:val="nil"/>
+        </w:tblBorders>
+        <w:tblLayout w:type="fixed"/>
+      </w:tblPr>
+      <w:tblGrid>
+        <w:gridCol w:w="4500"/>
+        <w:gridCol w:w="4500"/>
+      </w:tblGrid>
+      <w:tr>
+        <w:tc>
+          <w:tcPr>
+            <w:tcW w:w="4500" w:type="dxa"/>
+          </w:tcPr>
+          <w:p>
+            <w:pPr>
+              <w:jc w:val="center"/>
+            </w:pPr>
+            <w:r>
+              <w:drawing>
+                <wp:inline xmlns:a="http://schemas.openxmlformats.org/drawingml/2006/main" xmlns:pic="http://schemas.openxmlformats.org/drawingml/2006/picture">
+                  <wp:extent cx="2628000" cy="1928952"/>
+                  <wp:docPr id="900011" name="Picture 900011"/>
+                  <wp:cNvGraphicFramePr>
+                    <a:graphicFrameLocks noChangeAspect="1"/>
+                  </wp:cNvGraphicFramePr>
+                  <a:graphic>
+                    <a:graphicData uri="http://schemas.openxmlformats.org/drawingml/2006/picture">
+                      <pic:pic>
+                        <pic:nvPicPr>
+                          <pic:cNvPr id="0" name="1576281232_d.jpg"/>
+                          <pic:cNvPicPr/>
+                        </pic:nvPicPr>
+                        <pic:blipFill>
+                          <a:blip r:embed="rId11"/>
+                          <a:stretch>
+                            <a:fillRect/>
+                          </a:stretch>
+                        </pic:blipFill>
+                        <pic:spPr>
+                          <a:xfrm>
+                            <a:off x="0" y="0"/>
+                            <a:ext cx="2628000" cy="1928952"/>
+                          </a:xfrm>
+                          <a:prstGeom prst="rect"/>
+                        </pic:spPr>
+                      </pic:pic>
+                    </a:graphicData>
+                  </a:graphic>
+                </wp:inline>
+              </w:drawing>
+            </w:r>
+          </w:p>
+          <w:p>
+            <w:pPr>
+              <w:jc w:val="center"/>
+            </w:pPr>
+            <w:r>
+              <w:rPr>
+                <w:rFonts w:ascii="Times New Roman" w:hAnsi="Times New Roman" w:cs="Times New Roman"/>
+                <w:b/>
+                <w:bCs/>
+                <w:highlight w:val="yellow"/>
+                <w:lang w:val="tr-TR"/>
+              </w:rPr>
+              <w:t xml:space="preserve">Shutter id: 1576281232</w:t>
+            </w:r>
+          </w:p>
+          <w:p>
+            <w:pPr>
+              <w:jc w:val="center"/>
+              <w:rPr>
+                <w:rFonts w:ascii="Times New Roman" w:hAnsi="Times New Roman" w:cs="Times New Roman"/>
+                <w:lang w:val="tr-TR"/>
+              </w:rPr>
+            </w:pPr>
+            <w:r>
+              <w:rPr>
+                <w:rFonts w:ascii="Times New Roman" w:hAnsi="Times New Roman" w:cs="Times New Roman"/>
+                <w:lang w:val="tr-TR"/>
+              </w:rPr>
+              <w:t xml:space="preserve">Bir ailenin haftalık evsel atıkları</w:t>
+            </w:r>
+            <w:r>
+              <w:rPr>
+                <w:rFonts w:ascii="Times New Roman" w:hAnsi="Times New Roman" w:cs="Times New Roman"/>
+                <w:lang w:val="tr-TR"/>
+              </w:rPr>
+              <w:t xml:space="preserve"/>
+            </w:r>
+          </w:p>
+        </w:tc>
+        <w:tc>
+          <w:tcPr>
+            <w:tcW w:w="4500" w:type="dxa"/>
+          </w:tcPr>
+          <w:p>
+            <w:pPr>
+              <w:jc w:val="center"/>
+            </w:pPr>
+            <w:r>
+              <w:drawing>
+                <wp:inline xmlns:a="http://schemas.openxmlformats.org/drawingml/2006/main" xmlns:pic="http://schemas.openxmlformats.org/drawingml/2006/picture">
+                  <wp:extent cx="2628000" cy="1925448"/>
+                  <wp:docPr id="900019" name="Picture 900019"/>
+                  <wp:cNvGraphicFramePr>
+                    <a:graphicFrameLocks noChangeAspect="1"/>
+                  </wp:cNvGraphicFramePr>
+                  <a:graphic>
+                    <a:graphicData uri="http://schemas.openxmlformats.org/drawingml/2006/picture">
+                      <pic:pic>
+                        <pic:nvPicPr>
+                          <pic:cNvPr id="0" name="2436837253_d.jpg"/>
+                          <pic:cNvPicPr/>
+                        </pic:nvPicPr>
+                        <pic:blipFill>
+                          <a:blip r:embed="rId19"/>
+                          <a:stretch>
+                            <a:fillRect/>
+                          </a:stretch>
+                        </pic:blipFill>
+                        <pic:spPr>
+                          <a:xfrm>
+                            <a:off x="0" y="0"/>
+                            <a:ext cx="2628000" cy="1925448"/>
+                          </a:xfrm>
+                          <a:prstGeom prst="rect"/>
+                        </pic:spPr>
+                      </pic:pic>
+                    </a:graphicData>
+                  </a:graphic>
+                </wp:inline>
+              </w:drawing>
+            </w:r>
+          </w:p>
+          <w:p>
+            <w:pPr>
+              <w:jc w:val="center"/>
+            </w:pPr>
+            <w:r>
+              <w:rPr>
+                <w:rFonts w:ascii="Times New Roman" w:hAnsi="Times New Roman" w:cs="Times New Roman"/>
+                <w:b/>
+                <w:bCs/>
+                <w:highlight w:val="yellow"/>
+                <w:lang w:val="tr-TR"/>
+              </w:rPr>
+              <w:t xml:space="preserve">Shutter id: 2436837253</w:t>
+            </w:r>
+          </w:p>
+          <w:p>
+            <w:pPr>
+              <w:jc w:val="center"/>
+            </w:pPr>
+            <w:r>
+              <w:rPr>
+                <w:rFonts w:ascii="Times New Roman" w:hAnsi="Times New Roman" w:cs="Times New Roman"/>
+                <w:b/>
+                <w:bCs/>
+                <w:highlight w:val="yellow"/>
+                <w:lang w:val="tr-TR"/>
+              </w:rPr>
+              <w:t xml:space="preserve">NOT: Görseldeki İngilizce yazılar Türkçeye çevrilecek: GLASS: CAM; PLASTIC: PLASTİK; PAPER: KAĞIT; RECYCLE: GERİ DÖNÜŞÜM; RE-USE: YENİDEN KULLAN; REDUCE: AZALT.</w:t>
+            </w:r>
+          </w:p>
+          <w:p>
+            <w:pPr>
+              <w:jc w:val="center"/>
+              <w:rPr>
+                <w:rFonts w:ascii="Times New Roman" w:hAnsi="Times New Roman" w:cs="Times New Roman"/>
+                <w:lang w:val="tr-TR"/>
+              </w:rPr>
+            </w:pPr>
+            <w:r>
+              <w:rPr>
+                <w:rFonts w:ascii="Times New Roman" w:hAnsi="Times New Roman" w:cs="Times New Roman"/>
+                <w:lang w:val="tr-TR"/>
+              </w:rPr>
+              <w:t xml:space="preserve">Atıkların evde türlerine göre ayrıştırılması</w:t>
+            </w:r>
+            <w:r>
+              <w:rPr>
+                <w:rFonts w:ascii="Times New Roman" w:hAnsi="Times New Roman" w:cs="Times New Roman"/>
+                <w:lang w:val="tr-TR"/>
+              </w:rPr>
+              <w:t xml:space="preserve"/>
+            </w:r>
+          </w:p>
+        </w:tc>
+      </w:tr>
+    </w:tbl>
     <w:p>
       <w:pPr>
         <w:pStyle w:val="ListParagraph"/>

</xml_diff>